<commit_message>
Update MTRE 4820 Machine Learning Final Project Notes.docx
</commit_message>
<xml_diff>
--- a/mtre4820_final_project/MTRE 4820 Machine Learning Final Project Notes.docx
+++ b/mtre4820_final_project/MTRE 4820 Machine Learning Final Project Notes.docx
@@ -1551,744 +1551,366 @@
       </w:r>
     </w:p>
     <w:p/>
-    <w:p/>
+    <w:p>
+      <w:r>
+        <w:t>Set up these libraries:</w:t>
+      </w:r>
+    </w:p>
     <w:p>
       <w:r>
         <w:lastRenderedPageBreak/>
-        <w:t xml:space="preserve">This is the pseudo code of the data prep </w:t>
-      </w:r>
-      <w:proofErr w:type="spellStart"/>
-      <w:r>
-        <w:t>py</w:t>
-      </w:r>
-      <w:proofErr w:type="spellEnd"/>
-      <w:r>
-        <w:t xml:space="preserve"> file</w:t>
-      </w:r>
-      <w:r>
-        <w:t xml:space="preserve"> help with </w:t>
+        <w:t xml:space="preserve">pip install </w:t>
+      </w:r>
+      <w:proofErr w:type="spellStart"/>
+      <w:r>
+        <w:t>opencv</w:t>
+      </w:r>
+      <w:proofErr w:type="spellEnd"/>
+      <w:r>
+        <w:t xml:space="preserve">-python </w:t>
+      </w:r>
+      <w:proofErr w:type="spellStart"/>
+      <w:r>
+        <w:t>numpy</w:t>
+      </w:r>
+      <w:proofErr w:type="spellEnd"/>
+      <w:r>
+        <w:t xml:space="preserve"> pandas matplotlib </w:t>
+      </w:r>
+      <w:proofErr w:type="spellStart"/>
+      <w:r>
+        <w:t>tensorflow</w:t>
+      </w:r>
+      <w:proofErr w:type="spellEnd"/>
+      <w:r>
+        <w:t xml:space="preserve"> scikit-learn </w:t>
+      </w:r>
+      <w:proofErr w:type="spellStart"/>
+      <w:r>
+        <w:t>sympy</w:t>
+      </w:r>
+      <w:proofErr w:type="spellEnd"/>
+      <w:r>
+        <w:t xml:space="preserve"> </w:t>
+      </w:r>
+      <w:proofErr w:type="spellStart"/>
+      <w:r>
+        <w:t>cv_bridge</w:t>
+      </w:r>
+      <w:proofErr w:type="spellEnd"/>
+    </w:p>
+    <w:p>
+      <w:proofErr w:type="spellStart"/>
+      <w:r>
+        <w:t>sudo</w:t>
+      </w:r>
+      <w:proofErr w:type="spellEnd"/>
+      <w:r>
+        <w:t xml:space="preserve"> apt install </w:t>
+      </w:r>
+      <w:proofErr w:type="spellStart"/>
+      <w:r>
+        <w:t>ros</w:t>
+      </w:r>
+      <w:proofErr w:type="spellEnd"/>
+      <w:r>
+        <w:t>-humble-cv-bridge</w:t>
+      </w:r>
+    </w:p>
+    <w:p/>
+    <w:p>
+      <w:r>
+        <w:t>Check if installed right:</w:t>
+      </w:r>
+    </w:p>
+    <w:p>
+      <w:r>
+        <w:t xml:space="preserve">python3 -c "import cv2, </w:t>
+      </w:r>
+      <w:proofErr w:type="spellStart"/>
+      <w:r>
+        <w:t>numpy</w:t>
+      </w:r>
+      <w:proofErr w:type="spellEnd"/>
+      <w:r>
+        <w:t xml:space="preserve">, pandas, matplotlib, </w:t>
+      </w:r>
+      <w:proofErr w:type="spellStart"/>
+      <w:r>
+        <w:t>tensorflow</w:t>
+      </w:r>
+      <w:proofErr w:type="spellEnd"/>
+      <w:r>
+        <w:t xml:space="preserve">, </w:t>
+      </w:r>
+      <w:proofErr w:type="spellStart"/>
+      <w:r>
+        <w:t>sklearn</w:t>
+      </w:r>
+      <w:proofErr w:type="spellEnd"/>
+      <w:r>
+        <w:t xml:space="preserve">, </w:t>
+      </w:r>
+      <w:proofErr w:type="spellStart"/>
+      <w:r>
+        <w:t>sympy</w:t>
+      </w:r>
+      <w:proofErr w:type="spellEnd"/>
+      <w:r>
+        <w:t xml:space="preserve">; </w:t>
+      </w:r>
+      <w:proofErr w:type="gramStart"/>
+      <w:r>
+        <w:t>print(</w:t>
+      </w:r>
+      <w:proofErr w:type="gramEnd"/>
+      <w:r>
+        <w:t>'all good')"</w:t>
+      </w:r>
+    </w:p>
+    <w:p/>
+    <w:p/>
+    <w:p>
+      <w:r>
+        <w:t xml:space="preserve">Two nodes from </w:t>
       </w:r>
       <w:proofErr w:type="spellStart"/>
       <w:r>
         <w:t>claude</w:t>
       </w:r>
       <w:proofErr w:type="spellEnd"/>
-    </w:p>
-    <w:p>
-      <w:r>
-        <w:t xml:space="preserve">Sure, walking through </w:t>
-      </w:r>
-      <w:proofErr w:type="gramStart"/>
-      <w:r>
-        <w:t>it</w:t>
-      </w:r>
-      <w:proofErr w:type="gramEnd"/>
-      <w:r>
-        <w:t xml:space="preserve"> section by section.</w:t>
-      </w:r>
-    </w:p>
-    <w:p>
-      <w:r>
-        <w:pict w14:anchorId="37FFF27B">
-          <v:rect id="_x0000_i1025" style="width:0;height:1.5pt" o:hralign="center" o:hrstd="t" o:hr="t" fillcolor="#a0a0a0" stroked="f"/>
-        </w:pict>
-      </w:r>
-    </w:p>
-    <w:p>
-      <w:pPr>
-        <w:rPr>
-          <w:b/>
-          <w:bCs/>
-        </w:rPr>
-      </w:pPr>
-      <w:r>
-        <w:rPr>
-          <w:b/>
-          <w:bCs/>
-        </w:rPr>
-        <w:t>Imports and Configuration</w:t>
-      </w:r>
-    </w:p>
-    <w:p>
-      <w:r>
-        <w:t>ROBOT_X      = 0.0</w:t>
-      </w:r>
-    </w:p>
-    <w:p>
-      <w:r>
-        <w:t>ROBOT_Y      = 0.0</w:t>
-      </w:r>
-    </w:p>
-    <w:p>
-      <w:r>
-        <w:t>WORLD_</w:t>
-      </w:r>
-      <w:proofErr w:type="gramStart"/>
-      <w:r>
-        <w:t>RANGE  =</w:t>
-      </w:r>
-      <w:proofErr w:type="gramEnd"/>
-      <w:r>
-        <w:t xml:space="preserve"> 15.0</w:t>
-      </w:r>
-    </w:p>
-    <w:p>
-      <w:r>
-        <w:t>MAP_SIZE     = 700</w:t>
-      </w:r>
-    </w:p>
-    <w:p>
-      <w:r>
-        <w:t>FOV_DEG      = 30.0</w:t>
-      </w:r>
-    </w:p>
-    <w:p>
-      <w:r>
-        <w:t>FOV_DEPTH    = 10.0</w:t>
-      </w:r>
-    </w:p>
-    <w:p>
-      <w:r>
-        <w:t xml:space="preserve">These are all the tunable parameters at the </w:t>
-      </w:r>
-      <w:proofErr w:type="gramStart"/>
-      <w:r>
-        <w:t>top</w:t>
-      </w:r>
-      <w:proofErr w:type="gramEnd"/>
-      <w:r>
-        <w:t xml:space="preserve"> so you never have to dig into the code to change them. WORLD_RANGE means the map shows 15 meters in each direction from the origin. MAP_SIZE is the pixel size of the OpenCV map window. FOV_DEG is your ±30° camera limit.</w:t>
-      </w:r>
-    </w:p>
-    <w:p>
-      <w:r>
-        <w:pict w14:anchorId="710619A5">
-          <v:rect id="_x0000_i1026" style="width:0;height:1.5pt" o:hralign="center" o:hrstd="t" o:hr="t" fillcolor="#a0a0a0" stroked="f"/>
-        </w:pict>
-      </w:r>
-    </w:p>
-    <w:p>
-      <w:pPr>
-        <w:rPr>
-          <w:b/>
-          <w:bCs/>
-        </w:rPr>
-      </w:pPr>
-      <w:r>
-        <w:rPr>
-          <w:b/>
-          <w:bCs/>
-        </w:rPr>
-        <w:t>Math Helpers</w:t>
-      </w:r>
-    </w:p>
-    <w:p>
-      <w:r>
-        <w:t xml:space="preserve">These are the exact same arc math functions from your data prep pipeline — compute_p3, </w:t>
-      </w:r>
-      <w:proofErr w:type="spellStart"/>
-      <w:r>
-        <w:t>find_center</w:t>
-      </w:r>
-      <w:proofErr w:type="spellEnd"/>
-      <w:r>
-        <w:t xml:space="preserve">, </w:t>
-      </w:r>
-      <w:proofErr w:type="spellStart"/>
-      <w:r>
-        <w:t>compute_omega</w:t>
-      </w:r>
-      <w:proofErr w:type="spellEnd"/>
-      <w:r>
-        <w:t xml:space="preserve"> etc. They live here so the node can compute ω on the fly when you capture a sample, without needing an external script.</w:t>
-      </w:r>
-    </w:p>
-    <w:p>
-      <w:r>
-        <w:pict w14:anchorId="1212BB4A">
-          <v:rect id="_x0000_i1027" style="width:0;height:1.5pt" o:hralign="center" o:hrstd="t" o:hr="t" fillcolor="#a0a0a0" stroked="f"/>
-        </w:pict>
-      </w:r>
-    </w:p>
-    <w:p>
-      <w:pPr>
-        <w:rPr>
-          <w:b/>
-          <w:bCs/>
-        </w:rPr>
-      </w:pPr>
-      <w:proofErr w:type="spellStart"/>
-      <w:r>
-        <w:rPr>
-          <w:b/>
-          <w:bCs/>
-        </w:rPr>
-        <w:t>world_to_map</w:t>
-      </w:r>
-      <w:proofErr w:type="spellEnd"/>
-      <w:r>
-        <w:rPr>
-          <w:b/>
-          <w:bCs/>
-        </w:rPr>
-        <w:t xml:space="preserve"> and </w:t>
-      </w:r>
-      <w:proofErr w:type="spellStart"/>
-      <w:r>
-        <w:rPr>
-          <w:b/>
-          <w:bCs/>
-        </w:rPr>
-        <w:t>map_to_world</w:t>
-      </w:r>
-      <w:proofErr w:type="spellEnd"/>
-    </w:p>
-    <w:p>
-      <w:r>
-        <w:t xml:space="preserve">def </w:t>
-      </w:r>
-      <w:proofErr w:type="spellStart"/>
-      <w:r>
-        <w:t>world_to_</w:t>
-      </w:r>
-      <w:proofErr w:type="gramStart"/>
-      <w:r>
-        <w:t>map</w:t>
-      </w:r>
-      <w:proofErr w:type="spellEnd"/>
+      <w:r>
+        <w:t xml:space="preserve"> and chat</w:t>
+      </w:r>
+    </w:p>
+    <w:p>
+      <w:proofErr w:type="spellStart"/>
+      <w:r>
+        <w:t>cladue</w:t>
+      </w:r>
+      <w:proofErr w:type="spellEnd"/>
+      <w:r>
+        <w:t xml:space="preserve"> has a working map but cannot spawn multiple ambulances</w:t>
+      </w:r>
+    </w:p>
+    <w:p>
+      <w:r>
+        <w:t>Chat has no map but can somewhat spawn with orientation for vehicle</w:t>
+      </w:r>
+    </w:p>
+    <w:p/>
+    <w:p>
+      <w:r>
+        <w:t xml:space="preserve">I want the vehicle to rotate so what if we have it use a depth camera on it and if the camera sees something it does not rotate but </w:t>
+      </w:r>
+      <w:proofErr w:type="gramStart"/>
+      <w:r>
+        <w:t>let</w:t>
+      </w:r>
+      <w:proofErr w:type="gramEnd"/>
+      <w:r>
+        <w:t xml:space="preserve"> the ml model work</w:t>
+      </w:r>
+    </w:p>
+    <w:p>
+      <w:pPr>
+        <w:pStyle w:val="Heading2"/>
+      </w:pPr>
+      <w:r>
+        <w:t>Final doc</w:t>
+      </w:r>
+    </w:p>
+    <w:p>
+      <w:r>
+        <w:t xml:space="preserve">Our Machine </w:t>
+      </w:r>
+      <w:proofErr w:type="gramStart"/>
+      <w:r>
+        <w:t>learning model</w:t>
+      </w:r>
+      <w:proofErr w:type="gramEnd"/>
+      <w:r>
+        <w:t xml:space="preserve"> takes pictures of an ambulance from gazebo and gives a </w:t>
+      </w:r>
+      <w:proofErr w:type="spellStart"/>
+      <w:r>
+        <w:t>rosbot</w:t>
+      </w:r>
+      <w:proofErr w:type="spellEnd"/>
+      <w:r>
+        <w:t xml:space="preserve"> velocity commands for it to go to the ambulance. </w:t>
+      </w:r>
+    </w:p>
+    <w:p>
+      <w:pPr>
+        <w:pStyle w:val="Heading3"/>
+      </w:pPr>
+      <w:r>
+        <w:t>Data prep</w:t>
+      </w:r>
+      <w:r>
+        <w:tab/>
+      </w:r>
+    </w:p>
+    <w:p/>
+    <w:p>
+      <w:r>
+        <w:t xml:space="preserve">Took pictures of </w:t>
+      </w:r>
+      <w:proofErr w:type="gramStart"/>
+      <w:r>
+        <w:t>ambulance</w:t>
+      </w:r>
+      <w:proofErr w:type="gramEnd"/>
+      <w:r>
+        <w:t xml:space="preserve"> and calculated their angular velocity for it. Within the simulation gazebo, we recorded the coordinates of the </w:t>
+      </w:r>
+      <w:proofErr w:type="spellStart"/>
+      <w:r>
+        <w:t>rosbot</w:t>
+      </w:r>
+      <w:proofErr w:type="spellEnd"/>
+      <w:r>
+        <w:t xml:space="preserve"> and the ambulance for each picture. Each picture had </w:t>
+      </w:r>
+      <w:proofErr w:type="gramStart"/>
+      <w:r>
+        <w:t>the</w:t>
+      </w:r>
+      <w:proofErr w:type="gramEnd"/>
+      <w:r>
+        <w:t xml:space="preserve"> ambulance in the view of the </w:t>
+      </w:r>
+      <w:proofErr w:type="spellStart"/>
+      <w:r>
+        <w:t>rosbot</w:t>
+      </w:r>
+      <w:proofErr w:type="spellEnd"/>
+      <w:r>
+        <w:t xml:space="preserve"> camera and that image was saved. The </w:t>
+      </w:r>
+      <w:proofErr w:type="spellStart"/>
+      <w:r>
+        <w:t>ambulane</w:t>
+      </w:r>
+      <w:proofErr w:type="spellEnd"/>
+      <w:r>
+        <w:t xml:space="preserve"> was put at varying position and orientations. 200 pictures were taken.</w:t>
+      </w:r>
+    </w:p>
+    <w:p/>
+    <w:p/>
+    <w:p>
+      <w:pPr>
+        <w:pStyle w:val="Heading3"/>
+      </w:pPr>
+      <w:r>
+        <w:lastRenderedPageBreak/>
+        <w:t>Math part 1</w:t>
+      </w:r>
+    </w:p>
+    <w:p>
+      <w:r>
+        <w:t xml:space="preserve">Now we </w:t>
+      </w:r>
+      <w:proofErr w:type="gramStart"/>
+      <w:r>
+        <w:t>have to</w:t>
+      </w:r>
+      <w:proofErr w:type="gramEnd"/>
+      <w:r>
+        <w:t xml:space="preserve"> take the position of the two objects and create velocity commands from it. We are using a stock linear velocity of 0.5 m/s forward. This means we only need to calculate the angular velocity for the movement commands to be complete.</w:t>
+      </w:r>
+    </w:p>
+    <w:p>
+      <w:r>
+        <w:t xml:space="preserve">This was done </w:t>
+      </w:r>
+      <w:proofErr w:type="gramStart"/>
+      <w:r>
+        <w:t>by using</w:t>
+      </w:r>
+      <w:proofErr w:type="gramEnd"/>
+      <w:r>
+        <w:t xml:space="preserve"> creating a </w:t>
+      </w:r>
+      <w:proofErr w:type="gramStart"/>
+      <w:r>
+        <w:t>three point</w:t>
+      </w:r>
+      <w:proofErr w:type="gramEnd"/>
+      <w:r>
+        <w:t xml:space="preserve"> arc</w:t>
+      </w:r>
+      <w:r>
+        <w:t>.</w:t>
+      </w:r>
+      <w:r>
+        <w:t xml:space="preserve"> First two are the centers of the robot and the ambulance. The </w:t>
+      </w:r>
+      <w:r>
+        <w:t>third</w:t>
+      </w:r>
+      <w:r>
+        <w:t xml:space="preserve"> point will be a ratio using the distance between the </w:t>
+      </w:r>
+      <w:proofErr w:type="spellStart"/>
+      <w:r>
+        <w:t>rosbot</w:t>
+      </w:r>
+      <w:proofErr w:type="spellEnd"/>
+      <w:r>
+        <w:t xml:space="preserve"> and ambulance. The third point will be calculated like this: Go to the middle point in between the two points, draw a perpendicular line that is 1/4*distance</w:t>
+      </w:r>
+      <w:r>
+        <w:t xml:space="preserve">. </w:t>
+      </w:r>
+    </w:p>
+    <w:p>
+      <w:proofErr w:type="spellStart"/>
+      <w:r>
+        <w:t>Claculate</w:t>
+      </w:r>
+      <w:proofErr w:type="spellEnd"/>
+      <w:r>
+        <w:t xml:space="preserve"> a theta between the forward vector of the </w:t>
+      </w:r>
+      <w:proofErr w:type="spellStart"/>
+      <w:r>
+        <w:t>rosbot</w:t>
+      </w:r>
+      <w:proofErr w:type="spellEnd"/>
+      <w:r>
+        <w:t xml:space="preserve"> and the object from that vector.</w:t>
+      </w:r>
+    </w:p>
+    <w:p>
+      <w:r>
+        <w:t> </w:t>
+      </w:r>
+      <w:r>
+        <w:t>The ambulance position in the image gives a pixel coordinate x. The angle from the robot's heading to the ambulance is:</w:t>
+      </w:r>
+    </w:p>
+    <w:p>
+      <w:r>
+        <w:t xml:space="preserve">θ = </w:t>
+      </w:r>
+      <w:proofErr w:type="gramStart"/>
+      <w:r>
+        <w:t>arctan(</w:t>
+      </w:r>
+      <w:proofErr w:type="gramEnd"/>
       <w:r>
         <w:t>(</w:t>
       </w:r>
       <w:proofErr w:type="spellStart"/>
-      <w:proofErr w:type="gramEnd"/>
-      <w:r>
-        <w:t>wx</w:t>
-      </w:r>
-      <w:proofErr w:type="spellEnd"/>
-      <w:r>
-        <w:t xml:space="preserve">, </w:t>
-      </w:r>
-      <w:proofErr w:type="spellStart"/>
-      <w:r>
-        <w:t>wy</w:t>
-      </w:r>
-      <w:proofErr w:type="spellEnd"/>
-      <w:r>
-        <w:t>):</w:t>
-      </w:r>
-    </w:p>
-    <w:p>
-      <w:r>
-        <w:t xml:space="preserve">def </w:t>
-      </w:r>
-      <w:proofErr w:type="spellStart"/>
-      <w:r>
-        <w:t>map_to_</w:t>
-      </w:r>
-      <w:proofErr w:type="gramStart"/>
-      <w:r>
-        <w:t>world</w:t>
-      </w:r>
-      <w:proofErr w:type="spellEnd"/>
-      <w:r>
-        <w:t>(</w:t>
-      </w:r>
-      <w:proofErr w:type="spellStart"/>
-      <w:proofErr w:type="gramEnd"/>
-      <w:r>
-        <w:t>px</w:t>
-      </w:r>
-      <w:proofErr w:type="spellEnd"/>
-      <w:r>
-        <w:t xml:space="preserve">, </w:t>
-      </w:r>
-      <w:proofErr w:type="spellStart"/>
-      <w:r>
-        <w:t>py</w:t>
-      </w:r>
-      <w:proofErr w:type="spellEnd"/>
-      <w:r>
-        <w:t>):</w:t>
-      </w:r>
-    </w:p>
-    <w:p>
-      <w:r>
-        <w:t>These two functions are the bridge between Gazebo world coordinates (meters) and the OpenCV map window (pixels). When you click a pixel on the map it converts to meters for Gazebo. When the ambulance position is known in meters it converts back to pixels to draw the dot on the map. It is essentially a scaling and flipping operation — Y is flipped because screen coordinates go down but world Y goes up.</w:t>
-      </w:r>
-    </w:p>
-    <w:p>
-      <w:r>
-        <w:pict w14:anchorId="73A7D288">
-          <v:rect id="_x0000_i1028" style="width:0;height:1.5pt" o:hralign="center" o:hrstd="t" o:hr="t" fillcolor="#a0a0a0" stroked="f"/>
-        </w:pict>
-      </w:r>
-    </w:p>
-    <w:p>
-      <w:pPr>
-        <w:rPr>
-          <w:b/>
-          <w:bCs/>
-        </w:rPr>
-      </w:pPr>
-      <w:proofErr w:type="spellStart"/>
-      <w:r>
-        <w:rPr>
-          <w:b/>
-          <w:bCs/>
-        </w:rPr>
-        <w:lastRenderedPageBreak/>
-        <w:t>draw_map</w:t>
-      </w:r>
-      <w:proofErr w:type="spellEnd"/>
-    </w:p>
-    <w:p>
-      <w:r>
-        <w:t>This function redraws the map every 50ms. It draws the grid lines, the axes, the FOV cone, the robot dot, and the ambulance dot with an arrow showing which way it faces. The FOV cone is a filled triangle pointing up (robot heading) with the ±30° boundaries. The green shaded area is what the camera can see — if you spawn the ambulance outside it the camera will not see it.</w:t>
-      </w:r>
-    </w:p>
-    <w:p>
-      <w:r>
-        <w:pict w14:anchorId="0844A4A5">
-          <v:rect id="_x0000_i1029" style="width:0;height:1.5pt" o:hralign="center" o:hrstd="t" o:hr="t" fillcolor="#a0a0a0" stroked="f"/>
-        </w:pict>
-      </w:r>
-    </w:p>
-    <w:p>
-      <w:pPr>
-        <w:rPr>
-          <w:b/>
-          <w:bCs/>
-        </w:rPr>
-      </w:pPr>
-      <w:proofErr w:type="spellStart"/>
-      <w:r>
-        <w:rPr>
-          <w:b/>
-          <w:bCs/>
-        </w:rPr>
-        <w:t>AmbulanceController</w:t>
-      </w:r>
-      <w:proofErr w:type="spellEnd"/>
-      <w:r>
-        <w:rPr>
-          <w:b/>
-          <w:bCs/>
-        </w:rPr>
-        <w:t xml:space="preserve"> Node</w:t>
-      </w:r>
-    </w:p>
-    <w:p>
-      <w:r>
-        <w:t>This is the main ROS2 node. It has three things running simultaneously in separate threads:</w:t>
-      </w:r>
-    </w:p>
-    <w:p>
-      <w:proofErr w:type="spellStart"/>
-      <w:r>
-        <w:rPr>
-          <w:b/>
-          <w:bCs/>
-        </w:rPr>
-        <w:t>map_loop</w:t>
-      </w:r>
-      <w:proofErr w:type="spellEnd"/>
-      <w:r>
-        <w:t xml:space="preserve"> — keeps the OpenCV map window alive and responsive, </w:t>
-      </w:r>
-      <w:proofErr w:type="gramStart"/>
-      <w:r>
-        <w:t>redraws</w:t>
-      </w:r>
-      <w:proofErr w:type="gramEnd"/>
-      <w:r>
-        <w:t xml:space="preserve"> it constantly</w:t>
-      </w:r>
-    </w:p>
-    <w:p>
-      <w:proofErr w:type="spellStart"/>
-      <w:r>
-        <w:rPr>
-          <w:b/>
-          <w:bCs/>
-        </w:rPr>
-        <w:t>keyboard_loop</w:t>
-      </w:r>
-      <w:proofErr w:type="spellEnd"/>
-      <w:r>
-        <w:t xml:space="preserve"> — sits and waits for you to press Enter in the terminal, then triggers a capture</w:t>
-      </w:r>
-    </w:p>
-    <w:p>
-      <w:r>
-        <w:rPr>
-          <w:b/>
-          <w:bCs/>
-        </w:rPr>
-        <w:t>ROS spinning</w:t>
-      </w:r>
-      <w:r>
-        <w:t xml:space="preserve"> — handles all the topic subscriptions and service calls in the background</w:t>
-      </w:r>
-    </w:p>
-    <w:p>
-      <w:r>
-        <w:pict w14:anchorId="4C6CFD85">
-          <v:rect id="_x0000_i1030" style="width:0;height:1.5pt" o:hralign="center" o:hrstd="t" o:hr="t" fillcolor="#a0a0a0" stroked="f"/>
-        </w:pict>
-      </w:r>
-    </w:p>
-    <w:p>
-      <w:pPr>
-        <w:rPr>
-          <w:b/>
-          <w:bCs/>
-        </w:rPr>
-      </w:pPr>
-      <w:proofErr w:type="spellStart"/>
-      <w:r>
-        <w:rPr>
-          <w:b/>
-          <w:bCs/>
-        </w:rPr>
-        <w:t>map_click</w:t>
-      </w:r>
-      <w:proofErr w:type="spellEnd"/>
-    </w:p>
-    <w:p>
-      <w:r>
-        <w:t xml:space="preserve">def </w:t>
-      </w:r>
-      <w:proofErr w:type="spellStart"/>
-      <w:r>
-        <w:t>map_</w:t>
-      </w:r>
-      <w:proofErr w:type="gramStart"/>
-      <w:r>
-        <w:t>click</w:t>
-      </w:r>
-      <w:proofErr w:type="spellEnd"/>
-      <w:r>
-        <w:t>(</w:t>
-      </w:r>
-      <w:proofErr w:type="gramEnd"/>
-      <w:r>
-        <w:t xml:space="preserve">self, event, </w:t>
-      </w:r>
-      <w:proofErr w:type="spellStart"/>
-      <w:r>
-        <w:t>px</w:t>
-      </w:r>
-      <w:proofErr w:type="spellEnd"/>
-      <w:r>
-        <w:t xml:space="preserve">, </w:t>
-      </w:r>
-      <w:proofErr w:type="spellStart"/>
-      <w:r>
-        <w:t>py</w:t>
-      </w:r>
-      <w:proofErr w:type="spellEnd"/>
-      <w:r>
-        <w:t>, flags, param):</w:t>
-      </w:r>
-    </w:p>
-    <w:p>
-      <w:r>
-        <w:t xml:space="preserve">This is the mouse callback for the map window. It has </w:t>
-      </w:r>
-      <w:proofErr w:type="gramStart"/>
-      <w:r>
-        <w:t>a two</w:t>
-      </w:r>
-      <w:proofErr w:type="gramEnd"/>
-      <w:r>
-        <w:t xml:space="preserve"> click state </w:t>
-      </w:r>
-      <w:proofErr w:type="gramStart"/>
-      <w:r>
-        <w:t>machine</w:t>
-      </w:r>
-      <w:proofErr w:type="gramEnd"/>
-      <w:r>
-        <w:t>:</w:t>
-      </w:r>
-    </w:p>
-    <w:p>
-      <w:r>
-        <w:t xml:space="preserve">First click sets </w:t>
-      </w:r>
-      <w:proofErr w:type="gramStart"/>
-      <w:r>
-        <w:t>self.click</w:t>
-      </w:r>
-      <w:proofErr w:type="gramEnd"/>
-      <w:r>
-        <w:t>1 and stores the world position. A yellow dot appears on the map. The terminal asks for a second click.</w:t>
-      </w:r>
-    </w:p>
-    <w:p>
-      <w:r>
-        <w:t>Second click computes the yaw angle between click1 and click2 using atan2, then spawns the ambulance. atan2(</w:t>
-      </w:r>
-      <w:proofErr w:type="spellStart"/>
-      <w:r>
-        <w:t>dy</w:t>
-      </w:r>
-      <w:proofErr w:type="spellEnd"/>
-      <w:r>
-        <w:t xml:space="preserve">, dx) gives you the angle the ambulance would need to face to look from its position toward where you clicked. Then click1 resets to </w:t>
-      </w:r>
-      <w:proofErr w:type="gramStart"/>
-      <w:r>
-        <w:t>None ready</w:t>
-      </w:r>
-      <w:proofErr w:type="gramEnd"/>
-      <w:r>
-        <w:t xml:space="preserve"> for the next pair of clicks.</w:t>
-      </w:r>
-    </w:p>
-    <w:p>
-      <w:r>
-        <w:pict w14:anchorId="0C46BE45">
-          <v:rect id="_x0000_i1031" style="width:0;height:1.5pt" o:hralign="center" o:hrstd="t" o:hr="t" fillcolor="#a0a0a0" stroked="f"/>
-        </w:pict>
-      </w:r>
-    </w:p>
-    <w:p>
-      <w:pPr>
-        <w:rPr>
-          <w:b/>
-          <w:bCs/>
-        </w:rPr>
-      </w:pPr>
-      <w:proofErr w:type="spellStart"/>
-      <w:r>
-        <w:rPr>
-          <w:b/>
-          <w:bCs/>
-        </w:rPr>
-        <w:t>spawn_ambulance</w:t>
-      </w:r>
-      <w:proofErr w:type="spellEnd"/>
-      <w:r>
-        <w:rPr>
-          <w:b/>
-          <w:bCs/>
-        </w:rPr>
-        <w:t xml:space="preserve"> and </w:t>
-      </w:r>
-      <w:proofErr w:type="spellStart"/>
-      <w:r>
-        <w:rPr>
-          <w:b/>
-          <w:bCs/>
-        </w:rPr>
-        <w:t>delete_ambulance</w:t>
-      </w:r>
-      <w:proofErr w:type="spellEnd"/>
-    </w:p>
-    <w:p>
-      <w:r>
-        <w:t xml:space="preserve">def </w:t>
-      </w:r>
-      <w:proofErr w:type="spellStart"/>
-      <w:r>
-        <w:t>spawn_</w:t>
-      </w:r>
-      <w:proofErr w:type="gramStart"/>
-      <w:r>
-        <w:t>ambulance</w:t>
-      </w:r>
-      <w:proofErr w:type="spellEnd"/>
-      <w:r>
-        <w:t>(</w:t>
-      </w:r>
-      <w:proofErr w:type="gramEnd"/>
-      <w:r>
-        <w:t xml:space="preserve">self, </w:t>
-      </w:r>
-      <w:proofErr w:type="spellStart"/>
-      <w:r>
-        <w:t>wx</w:t>
-      </w:r>
-      <w:proofErr w:type="spellEnd"/>
-      <w:r>
-        <w:t xml:space="preserve">, </w:t>
-      </w:r>
-      <w:proofErr w:type="spellStart"/>
-      <w:r>
-        <w:t>wy</w:t>
-      </w:r>
-      <w:proofErr w:type="spellEnd"/>
-      <w:r>
-        <w:t>, yaw):</w:t>
-      </w:r>
-    </w:p>
-    <w:p>
-      <w:r>
-        <w:t xml:space="preserve">def </w:t>
-      </w:r>
-      <w:proofErr w:type="spellStart"/>
-      <w:r>
-        <w:t>delete_ambulance</w:t>
-      </w:r>
-      <w:proofErr w:type="spellEnd"/>
-      <w:r>
-        <w:t>(self):</w:t>
-      </w:r>
-    </w:p>
-    <w:p>
-      <w:proofErr w:type="spellStart"/>
-      <w:r>
-        <w:t>delete_ambulance</w:t>
-      </w:r>
-      <w:proofErr w:type="spellEnd"/>
-      <w:r>
-        <w:t xml:space="preserve"> calls the /</w:t>
-      </w:r>
-      <w:proofErr w:type="spellStart"/>
-      <w:r>
-        <w:t>delete_entity</w:t>
-      </w:r>
-      <w:proofErr w:type="spellEnd"/>
-      <w:r>
-        <w:t xml:space="preserve"> Gazebo service to remove the existing ambulance. </w:t>
-      </w:r>
-      <w:proofErr w:type="spellStart"/>
-      <w:r>
-        <w:t>spawn_ambulance</w:t>
-      </w:r>
-      <w:proofErr w:type="spellEnd"/>
-      <w:r>
-        <w:t xml:space="preserve"> calls /</w:t>
-      </w:r>
-      <w:proofErr w:type="spellStart"/>
-      <w:r>
-        <w:t>spawn_entity</w:t>
-      </w:r>
-      <w:proofErr w:type="spellEnd"/>
-      <w:r>
-        <w:t xml:space="preserve"> with the SDF content, the position, and </w:t>
-      </w:r>
-      <w:proofErr w:type="gramStart"/>
-      <w:r>
-        <w:lastRenderedPageBreak/>
-        <w:t>the</w:t>
-      </w:r>
-      <w:proofErr w:type="gramEnd"/>
-      <w:r>
-        <w:t xml:space="preserve"> quaternion </w:t>
-      </w:r>
-      <w:proofErr w:type="gramStart"/>
-      <w:r>
-        <w:t>converted</w:t>
-      </w:r>
-      <w:proofErr w:type="gramEnd"/>
-      <w:r>
-        <w:t xml:space="preserve"> from yaw. The quaternion conversion is needed because Gazebo uses quaternions not </w:t>
-      </w:r>
-      <w:proofErr w:type="spellStart"/>
-      <w:r>
-        <w:t>euler</w:t>
-      </w:r>
-      <w:proofErr w:type="spellEnd"/>
-      <w:r>
-        <w:t xml:space="preserve"> angles — </w:t>
-      </w:r>
-      <w:proofErr w:type="spellStart"/>
-      <w:r>
-        <w:t>yaw_to_quaternion</w:t>
-      </w:r>
-      <w:proofErr w:type="spellEnd"/>
-      <w:r>
-        <w:t xml:space="preserve"> does that math.</w:t>
-      </w:r>
-    </w:p>
-    <w:p>
-      <w:r>
-        <w:t xml:space="preserve">The spawn runs in its own </w:t>
-      </w:r>
-      <w:proofErr w:type="gramStart"/>
-      <w:r>
-        <w:t>thread</w:t>
-      </w:r>
-      <w:proofErr w:type="gramEnd"/>
-      <w:r>
-        <w:t xml:space="preserve"> so the map window stays responsive while Gazebo is processing the spawn request.</w:t>
-      </w:r>
-    </w:p>
-    <w:p>
-      <w:r>
-        <w:pict w14:anchorId="10FE2693">
-          <v:rect id="_x0000_i1032" style="width:0;height:1.5pt" o:hralign="center" o:hrstd="t" o:hr="t" fillcolor="#a0a0a0" stroked="f"/>
-        </w:pict>
-      </w:r>
-    </w:p>
-    <w:p>
-      <w:pPr>
-        <w:rPr>
-          <w:b/>
-          <w:bCs/>
-        </w:rPr>
-      </w:pPr>
-      <w:proofErr w:type="spellStart"/>
-      <w:r>
-        <w:rPr>
-          <w:b/>
-          <w:bCs/>
-        </w:rPr>
-        <w:t>capture_sample</w:t>
-      </w:r>
-      <w:proofErr w:type="spellEnd"/>
-    </w:p>
-    <w:p>
-      <w:r>
-        <w:t>This runs when you press Enter. It does five things in order:</w:t>
-      </w:r>
-    </w:p>
-    <w:p>
-      <w:pPr>
-        <w:numPr>
-          <w:ilvl w:val="0"/>
-          <w:numId w:val="7"/>
-        </w:numPr>
-      </w:pPr>
-      <w:r>
-        <w:t>Gets the robot pose from /</w:t>
-      </w:r>
-      <w:proofErr w:type="spellStart"/>
-      <w:r>
-        <w:t>tf</w:t>
-      </w:r>
-      <w:proofErr w:type="spellEnd"/>
-    </w:p>
-    <w:p>
-      <w:pPr>
-        <w:numPr>
-          <w:ilvl w:val="0"/>
-          <w:numId w:val="7"/>
-        </w:numPr>
-      </w:pPr>
-      <w:r>
-        <w:t>Opens the camera image in a popup window for you to click the ambulance</w:t>
-      </w:r>
-    </w:p>
-    <w:p>
-      <w:pPr>
-        <w:numPr>
-          <w:ilvl w:val="0"/>
-          <w:numId w:val="7"/>
-        </w:numPr>
-      </w:pPr>
-      <w:r>
-        <w:t xml:space="preserve">Converts the clicked pixel to θ using </w:t>
-      </w:r>
-      <w:proofErr w:type="gramStart"/>
-      <w:r>
-        <w:t>arctan(</w:t>
-      </w:r>
-      <w:proofErr w:type="gramEnd"/>
-      <w:r>
-        <w:t xml:space="preserve">(x - cx) / </w:t>
+      <w:r>
+        <w:t>x_pixel</w:t>
+      </w:r>
+      <w:proofErr w:type="spellEnd"/>
+      <w:r>
+        <w:t xml:space="preserve"> - cx) / </w:t>
       </w:r>
       <w:proofErr w:type="spellStart"/>
       <w:r>
@@ -2300,331 +1922,27 @@
       </w:r>
     </w:p>
     <w:p>
-      <w:pPr>
-        <w:numPr>
-          <w:ilvl w:val="0"/>
-          <w:numId w:val="7"/>
-        </w:numPr>
-      </w:pPr>
-      <w:r>
-        <w:t>Runs the full arc math to get ω</w:t>
-      </w:r>
-    </w:p>
-    <w:p>
-      <w:pPr>
-        <w:numPr>
-          <w:ilvl w:val="0"/>
-          <w:numId w:val="7"/>
-        </w:numPr>
-      </w:pPr>
-      <w:r>
-        <w:t>Saves the image to the images folder and appends a row to the CSV</w:t>
-      </w:r>
-    </w:p>
-    <w:p>
-      <w:r>
-        <w:pict w14:anchorId="011A9026">
-          <v:rect id="_x0000_i1033" style="width:0;height:1.5pt" o:hralign="center" o:hrstd="t" o:hr="t" fillcolor="#a0a0a0" stroked="f"/>
-        </w:pict>
-      </w:r>
-    </w:p>
-    <w:p>
-      <w:pPr>
-        <w:rPr>
-          <w:b/>
-          <w:bCs/>
-        </w:rPr>
-      </w:pPr>
-      <w:r>
-        <w:rPr>
-          <w:b/>
-          <w:bCs/>
-        </w:rPr>
-        <w:t>The SDF Content</w:t>
-      </w:r>
-    </w:p>
-    <w:p>
-      <w:r>
-        <w:t xml:space="preserve">The ambulance model definition is embedded directly as a string in the code rather than reading from a file. This means you only need this one Python file — no external SDF file required. It is the same content from your </w:t>
-      </w:r>
-      <w:proofErr w:type="spellStart"/>
-      <w:r>
-        <w:t>model.sdf</w:t>
-      </w:r>
-      <w:proofErr w:type="spellEnd"/>
-      <w:r>
-        <w:t xml:space="preserve"> file.</w:t>
-      </w:r>
-    </w:p>
-    <w:p>
-      <w:r>
-        <w:pict w14:anchorId="7318C4DD">
-          <v:rect id="_x0000_i1034" style="width:0;height:1.5pt" o:hralign="center" o:hrstd="t" o:hr="t" fillcolor="#a0a0a0" stroked="f"/>
-        </w:pict>
-      </w:r>
-    </w:p>
-    <w:p>
-      <w:pPr>
-        <w:rPr>
-          <w:b/>
-          <w:bCs/>
-        </w:rPr>
-      </w:pPr>
-      <w:r>
-        <w:rPr>
-          <w:b/>
-          <w:bCs/>
-        </w:rPr>
-        <w:t>The Full Loop in Plain English</w:t>
-      </w:r>
-    </w:p>
-    <w:p>
-      <w:r>
-        <w:t>Open map window</w:t>
-      </w:r>
-    </w:p>
-    <w:p>
-      <w:r>
-        <w:t>↓</w:t>
-      </w:r>
-    </w:p>
-    <w:p>
-      <w:r>
-        <w:t>Click position on map → yellow dot appears</w:t>
-      </w:r>
-    </w:p>
-    <w:p>
-      <w:r>
-        <w:t xml:space="preserve">↓  </w:t>
-      </w:r>
-    </w:p>
-    <w:p>
-      <w:r>
-        <w:t>Click direction on map → ambulance spawns in Gazebo facing that way</w:t>
-      </w:r>
-    </w:p>
-    <w:p>
-      <w:r>
-        <w:t>↓</w:t>
-      </w:r>
-    </w:p>
-    <w:p>
-      <w:r>
-        <w:t>Press Enter → camera window pops up</w:t>
-      </w:r>
-    </w:p>
-    <w:p>
-      <w:r>
-        <w:t>↓</w:t>
-      </w:r>
-    </w:p>
-    <w:p>
-      <w:r>
-        <w:lastRenderedPageBreak/>
-        <w:t>Click ambulance in camera → theta computed → omega computed</w:t>
-      </w:r>
-    </w:p>
-    <w:p>
-      <w:r>
-        <w:t>↓</w:t>
-      </w:r>
-    </w:p>
-    <w:p>
-      <w:r>
-        <w:t>Image saved, CSV row written</w:t>
-      </w:r>
-    </w:p>
-    <w:p>
-      <w:r>
-        <w:t>↓</w:t>
-      </w:r>
-    </w:p>
-    <w:p>
-      <w:r>
-        <w:t>Go back to clicking map for next sample</w:t>
-      </w:r>
-    </w:p>
-    <w:p/>
-    <w:p/>
-    <w:p>
-      <w:r>
-        <w:t>Set up these libraries:</w:t>
-      </w:r>
-    </w:p>
-    <w:p>
-      <w:r>
-        <w:t xml:space="preserve">pip install </w:t>
-      </w:r>
-      <w:proofErr w:type="spellStart"/>
-      <w:r>
-        <w:t>opencv</w:t>
-      </w:r>
-      <w:proofErr w:type="spellEnd"/>
-      <w:r>
-        <w:t xml:space="preserve">-python </w:t>
-      </w:r>
-      <w:proofErr w:type="spellStart"/>
-      <w:r>
-        <w:t>numpy</w:t>
-      </w:r>
-      <w:proofErr w:type="spellEnd"/>
-      <w:r>
-        <w:t xml:space="preserve"> pandas matplotlib </w:t>
-      </w:r>
-      <w:proofErr w:type="spellStart"/>
-      <w:r>
-        <w:t>tensorflow</w:t>
-      </w:r>
-      <w:proofErr w:type="spellEnd"/>
-      <w:r>
-        <w:t xml:space="preserve"> scikit-learn </w:t>
-      </w:r>
-      <w:proofErr w:type="spellStart"/>
-      <w:r>
-        <w:t>sympy</w:t>
-      </w:r>
-      <w:proofErr w:type="spellEnd"/>
-      <w:r>
-        <w:t xml:space="preserve"> </w:t>
-      </w:r>
-      <w:proofErr w:type="spellStart"/>
-      <w:r>
-        <w:t>cv_bridge</w:t>
-      </w:r>
-      <w:proofErr w:type="spellEnd"/>
-    </w:p>
-    <w:p>
-      <w:proofErr w:type="spellStart"/>
-      <w:r>
-        <w:t>sudo</w:t>
-      </w:r>
-      <w:proofErr w:type="spellEnd"/>
-      <w:r>
-        <w:t xml:space="preserve"> apt install </w:t>
-      </w:r>
-      <w:proofErr w:type="spellStart"/>
-      <w:r>
-        <w:t>ros</w:t>
-      </w:r>
-      <w:proofErr w:type="spellEnd"/>
-      <w:r>
-        <w:t>-humble-cv-bridge</w:t>
-      </w:r>
-    </w:p>
-    <w:p/>
-    <w:p>
-      <w:r>
-        <w:t>Check if installed right:</w:t>
-      </w:r>
-    </w:p>
-    <w:p>
-      <w:r>
-        <w:t xml:space="preserve">python3 -c "import cv2, </w:t>
-      </w:r>
-      <w:proofErr w:type="spellStart"/>
-      <w:r>
-        <w:t>numpy</w:t>
-      </w:r>
-      <w:proofErr w:type="spellEnd"/>
-      <w:r>
-        <w:t xml:space="preserve">, pandas, matplotlib, </w:t>
-      </w:r>
-      <w:proofErr w:type="spellStart"/>
-      <w:r>
-        <w:t>tensorflow</w:t>
-      </w:r>
-      <w:proofErr w:type="spellEnd"/>
-      <w:r>
-        <w:t xml:space="preserve">, </w:t>
-      </w:r>
-      <w:proofErr w:type="spellStart"/>
-      <w:r>
-        <w:t>sklearn</w:t>
-      </w:r>
-      <w:proofErr w:type="spellEnd"/>
-      <w:r>
-        <w:t xml:space="preserve">, </w:t>
-      </w:r>
-      <w:proofErr w:type="spellStart"/>
-      <w:r>
-        <w:t>sympy</w:t>
-      </w:r>
-      <w:proofErr w:type="spellEnd"/>
-      <w:r>
-        <w:t xml:space="preserve">; </w:t>
-      </w:r>
-      <w:proofErr w:type="gramStart"/>
-      <w:r>
-        <w:t>print(</w:t>
-      </w:r>
-      <w:proofErr w:type="gramEnd"/>
-      <w:r>
-        <w:t>'all good')"</w:t>
-      </w:r>
-    </w:p>
-    <w:p/>
-    <w:p/>
-    <w:p>
-      <w:r>
-        <w:t xml:space="preserve">Two nodes from </w:t>
-      </w:r>
-      <w:proofErr w:type="spellStart"/>
-      <w:r>
-        <w:t>claude</w:t>
-      </w:r>
-      <w:proofErr w:type="spellEnd"/>
-      <w:r>
-        <w:t xml:space="preserve"> and chat</w:t>
-      </w:r>
-    </w:p>
-    <w:p>
-      <w:proofErr w:type="spellStart"/>
-      <w:r>
-        <w:t>cladue</w:t>
-      </w:r>
-      <w:proofErr w:type="spellEnd"/>
-      <w:r>
-        <w:t xml:space="preserve"> has a working map but cannot spawn multiple ambulances</w:t>
-      </w:r>
-    </w:p>
-    <w:p>
-      <w:r>
-        <w:t>Chat has no map but can somewhat spawn with orientation for vehicle</w:t>
-      </w:r>
-    </w:p>
-    <w:p/>
-    <w:p>
-      <w:r>
-        <w:t xml:space="preserve">I want the vehicle to rotate so what if we have it use a depth camera on it and if the camera sees something it does not rotate but </w:t>
-      </w:r>
-      <w:proofErr w:type="gramStart"/>
-      <w:r>
-        <w:t>let</w:t>
-      </w:r>
-      <w:proofErr w:type="gramEnd"/>
-      <w:r>
-        <w:t xml:space="preserve"> the ml model work</w:t>
-      </w:r>
-    </w:p>
-    <w:p>
-      <w:pPr>
-        <w:pStyle w:val="Heading2"/>
-      </w:pPr>
-      <w:r>
-        <w:t>Final doc</w:t>
-      </w:r>
-    </w:p>
-    <w:p>
-      <w:r>
-        <w:t xml:space="preserve">Our Machine </w:t>
-      </w:r>
-      <w:proofErr w:type="gramStart"/>
-      <w:r>
-        <w:t>learning model</w:t>
-      </w:r>
-      <w:proofErr w:type="gramEnd"/>
-      <w:r>
-        <w:t xml:space="preserve"> takes pictures of an ambulance from gazebo and gives a </w:t>
+      <w:r>
+        <w:t xml:space="preserve">The focal length </w:t>
+      </w:r>
+      <w:proofErr w:type="spellStart"/>
+      <w:r>
+        <w:t>fx</w:t>
+      </w:r>
+      <w:proofErr w:type="spellEnd"/>
+      <w:r>
+        <w:t xml:space="preserve"> acts as a synthetic depth in pixel units, completing the right triangle needed to recover the angle even though the camera discards real depth information. The camera's 60° FOV limits θ to ±30°, which naturally bounds the arc curvature to what the robot can physically follow.</w:t>
+      </w:r>
+    </w:p>
+    <w:p>
+      <w:r>
+        <w:t>This equation is how we get the theta for the pictures.</w:t>
+      </w:r>
+    </w:p>
+    <w:p/>
+    <w:p>
+      <w:r>
+        <w:t xml:space="preserve"> Multiply the theta by the ¼*distance*sin(theta) and theta was used because as the </w:t>
       </w:r>
       <w:proofErr w:type="spellStart"/>
       <w:r>
@@ -2632,218 +1950,6 @@
       </w:r>
       <w:proofErr w:type="spellEnd"/>
       <w:r>
-        <w:t xml:space="preserve"> velocity commands for it to go to the ambulance. </w:t>
-      </w:r>
-    </w:p>
-    <w:p>
-      <w:pPr>
-        <w:pStyle w:val="Heading3"/>
-      </w:pPr>
-      <w:r>
-        <w:lastRenderedPageBreak/>
-        <w:t>Data prep</w:t>
-      </w:r>
-      <w:r>
-        <w:tab/>
-      </w:r>
-    </w:p>
-    <w:p/>
-    <w:p>
-      <w:r>
-        <w:t xml:space="preserve">Took pictures of </w:t>
-      </w:r>
-      <w:proofErr w:type="gramStart"/>
-      <w:r>
-        <w:t>ambulance</w:t>
-      </w:r>
-      <w:proofErr w:type="gramEnd"/>
-      <w:r>
-        <w:t xml:space="preserve"> and calculated their angular velocity for it. Within the simulation gazebo, we recorded the coordinates of the </w:t>
-      </w:r>
-      <w:proofErr w:type="spellStart"/>
-      <w:r>
-        <w:t>rosbot</w:t>
-      </w:r>
-      <w:proofErr w:type="spellEnd"/>
-      <w:r>
-        <w:t xml:space="preserve"> and the ambulance for each picture. Each picture had </w:t>
-      </w:r>
-      <w:proofErr w:type="gramStart"/>
-      <w:r>
-        <w:t>the</w:t>
-      </w:r>
-      <w:proofErr w:type="gramEnd"/>
-      <w:r>
-        <w:t xml:space="preserve"> ambulance in the view of the </w:t>
-      </w:r>
-      <w:proofErr w:type="spellStart"/>
-      <w:r>
-        <w:t>rosbot</w:t>
-      </w:r>
-      <w:proofErr w:type="spellEnd"/>
-      <w:r>
-        <w:t xml:space="preserve"> camera and that image was saved. The </w:t>
-      </w:r>
-      <w:proofErr w:type="spellStart"/>
-      <w:r>
-        <w:t>ambulane</w:t>
-      </w:r>
-      <w:proofErr w:type="spellEnd"/>
-      <w:r>
-        <w:t xml:space="preserve"> was put at varying position and orientations. 200 pictures were taken.</w:t>
-      </w:r>
-    </w:p>
-    <w:p/>
-    <w:p/>
-    <w:p>
-      <w:pPr>
-        <w:pStyle w:val="Heading3"/>
-      </w:pPr>
-      <w:r>
-        <w:t>Math part 1</w:t>
-      </w:r>
-    </w:p>
-    <w:p>
-      <w:r>
-        <w:t xml:space="preserve">Now we </w:t>
-      </w:r>
-      <w:proofErr w:type="gramStart"/>
-      <w:r>
-        <w:t>have to</w:t>
-      </w:r>
-      <w:proofErr w:type="gramEnd"/>
-      <w:r>
-        <w:t xml:space="preserve"> take the position of the two objects and create velocity commands from it. We are using a stock linear velocity of 0.5 m/s forward. This means we only need to calculate the angular velocity for the movement commands to be complete.</w:t>
-      </w:r>
-    </w:p>
-    <w:p>
-      <w:r>
-        <w:t xml:space="preserve">This was done </w:t>
-      </w:r>
-      <w:proofErr w:type="gramStart"/>
-      <w:r>
-        <w:t>by using</w:t>
-      </w:r>
-      <w:proofErr w:type="gramEnd"/>
-      <w:r>
-        <w:t xml:space="preserve"> creating a </w:t>
-      </w:r>
-      <w:proofErr w:type="gramStart"/>
-      <w:r>
-        <w:t>three point</w:t>
-      </w:r>
-      <w:proofErr w:type="gramEnd"/>
-      <w:r>
-        <w:t xml:space="preserve"> arc</w:t>
-      </w:r>
-      <w:r>
-        <w:t>.</w:t>
-      </w:r>
-      <w:r>
-        <w:t xml:space="preserve"> First two are the centers of the robot and the ambulance. The </w:t>
-      </w:r>
-      <w:r>
-        <w:t>third</w:t>
-      </w:r>
-      <w:r>
-        <w:t xml:space="preserve"> point will be a ratio using the distance between the </w:t>
-      </w:r>
-      <w:proofErr w:type="spellStart"/>
-      <w:r>
-        <w:t>rosbot</w:t>
-      </w:r>
-      <w:proofErr w:type="spellEnd"/>
-      <w:r>
-        <w:t xml:space="preserve"> and ambulance. The third point will be calculated like this: Go to the middle point in between the two points, draw a perpendicular line that is 1/4*distance</w:t>
-      </w:r>
-      <w:r>
-        <w:t xml:space="preserve">. </w:t>
-      </w:r>
-    </w:p>
-    <w:p>
-      <w:proofErr w:type="spellStart"/>
-      <w:r>
-        <w:t>Claculate</w:t>
-      </w:r>
-      <w:proofErr w:type="spellEnd"/>
-      <w:r>
-        <w:t xml:space="preserve"> a theta between the forward vector of the </w:t>
-      </w:r>
-      <w:proofErr w:type="spellStart"/>
-      <w:r>
-        <w:t>rosbot</w:t>
-      </w:r>
-      <w:proofErr w:type="spellEnd"/>
-      <w:r>
-        <w:t xml:space="preserve"> and the object from that vector.</w:t>
-      </w:r>
-    </w:p>
-    <w:p>
-      <w:r>
-        <w:t> </w:t>
-      </w:r>
-      <w:r>
-        <w:t>The ambulance position in the image gives a pixel coordinate x. The angle from the robot's heading to the ambulance is:</w:t>
-      </w:r>
-    </w:p>
-    <w:p>
-      <w:r>
-        <w:t xml:space="preserve">θ = </w:t>
-      </w:r>
-      <w:proofErr w:type="gramStart"/>
-      <w:r>
-        <w:t>arctan(</w:t>
-      </w:r>
-      <w:proofErr w:type="gramEnd"/>
-      <w:r>
-        <w:t>(</w:t>
-      </w:r>
-      <w:proofErr w:type="spellStart"/>
-      <w:r>
-        <w:t>x_pixel</w:t>
-      </w:r>
-      <w:proofErr w:type="spellEnd"/>
-      <w:r>
-        <w:t xml:space="preserve"> - cx) / </w:t>
-      </w:r>
-      <w:proofErr w:type="spellStart"/>
-      <w:r>
-        <w:t>fx</w:t>
-      </w:r>
-      <w:proofErr w:type="spellEnd"/>
-      <w:r>
-        <w:t>)</w:t>
-      </w:r>
-    </w:p>
-    <w:p>
-      <w:r>
-        <w:t xml:space="preserve">The focal length </w:t>
-      </w:r>
-      <w:proofErr w:type="spellStart"/>
-      <w:r>
-        <w:t>fx</w:t>
-      </w:r>
-      <w:proofErr w:type="spellEnd"/>
-      <w:r>
-        <w:t xml:space="preserve"> acts as a synthetic depth in pixel units, completing the right triangle needed to recover the angle even though the camera discards real depth information. The camera's 60° FOV limits θ to ±30°, which naturally bounds the arc curvature to what the robot can physically follow.</w:t>
-      </w:r>
-    </w:p>
-    <w:p>
-      <w:r>
-        <w:t>This equation is how we get the theta for the pictures.</w:t>
-      </w:r>
-    </w:p>
-    <w:p/>
-    <w:p>
-      <w:r>
-        <w:t xml:space="preserve"> Multiply the theta by the ¼*distance*sin(theta) and theta was used because as the </w:t>
-      </w:r>
-      <w:proofErr w:type="spellStart"/>
-      <w:r>
-        <w:t>rosbot</w:t>
-      </w:r>
-      <w:proofErr w:type="spellEnd"/>
-      <w:r>
         <w:t xml:space="preserve"> has </w:t>
       </w:r>
       <w:proofErr w:type="spellStart"/>
@@ -2857,11 +1963,7 @@
         <w:t xml:space="preserve"> ambulance more directly in front of it, the less of a bend the arc needs to be, so the theta causes the distances from the center of the cord to be smaller. </w:t>
       </w:r>
       <w:r>
-        <w:t xml:space="preserve">The direction the line </w:t>
-      </w:r>
-      <w:r>
-        <w:lastRenderedPageBreak/>
-        <w:t xml:space="preserve">will </w:t>
+        <w:t xml:space="preserve">The direction the line will </w:t>
       </w:r>
       <w:proofErr w:type="gramStart"/>
       <w:r>
@@ -2962,6 +2064,7 @@
         </w:numPr>
       </w:pPr>
       <w:r>
+        <w:lastRenderedPageBreak/>
         <w:t>Radius of circle --- We then just need to subtract this circle center from one of our points on the circle, so it would be radius by getting the distance formula for P1-C which we will call R</w:t>
       </w:r>
     </w:p>
@@ -3076,11 +2179,7 @@
       </w:r>
       <w:proofErr w:type="spellEnd"/>
       <w:r>
-        <w:t xml:space="preserve"> and spawn an ambulance in a random spot within its field of view. We would run a node that would import that camera data, call the ML model, and output an angular </w:t>
-      </w:r>
-      <w:r>
-        <w:lastRenderedPageBreak/>
-        <w:t xml:space="preserve">velocity. Within the video, the rover would traverse with the ambulance </w:t>
+        <w:t xml:space="preserve"> and spawn an ambulance in a random spot within its field of view. We would run a node that would import that camera data, call the ML model, and output an angular velocity. Within the video, the rover would traverse with the ambulance </w:t>
       </w:r>
       <w:proofErr w:type="gramStart"/>
       <w:r>
@@ -3509,7 +2608,6 @@
     <w:p/>
     <w:p>
       <w:r>
-        <w:lastRenderedPageBreak/>
         <w:t>Work we did:</w:t>
       </w:r>
     </w:p>
@@ -3590,6 +2688,7 @@
     </w:p>
     <w:p>
       <w:r>
+        <w:lastRenderedPageBreak/>
         <w:t>gramisaam@LAPTOP-4OTR9</w:t>
       </w:r>
       <w:proofErr w:type="gramStart"/>
@@ -3727,6 +2826,7 @@
     <w:p/>
     <w:p>
       <w:r>
+        <w:lastRenderedPageBreak/>
         <w:t xml:space="preserve">Update the entire </w:t>
       </w:r>
       <w:proofErr w:type="gramStart"/>

</xml_diff>